<commit_message>
Update reference-instrument label and value in certificate template
Rename the reference-instrument "製造番号" (Serial No.) field to
"機器番号・証明書番号" (Device No. / Certificate No.) and update its
value from B250884 to MC255B012-B260691 in the calibration certificate
Word template, mirrored in the test fixture copy.
</commit_message>
<xml_diff>
--- a/apps/api/ite_api/calibration/template.docx
+++ b/apps/api/ite_api/calibration/template.docx
@@ -921,7 +921,7 @@
           <w:u w:val="single"/>
           <w:lang w:eastAsia="zh-CN"/>
         </w:rPr>
-        <w:t xml:space="preserve">製造番号　　　　　 </w:t>
+        <w:t xml:space="preserve">機器番号・証明書番号　</w:t>
       </w:r>
       <w:r>
         <w:rPr>
@@ -993,7 +993,7 @@
         <w:rPr>
           <w:rFonts w:ascii="MS Mincho" w:eastAsia="MS Mincho" w:hAnsi="MS Mincho"/>
         </w:rPr>
-        <w:t>B250884</w:t>
+        <w:t>MC255B012-B260691</w:t>
       </w:r>
       <w:r>
         <w:rPr>

</xml_diff>

<commit_message>
Fix reference-instrument row wrapping in certificate template
The new "機器番号・証明書番号" value (MC255B012-B260691) is longer than
the old "製造番号" value, and the template's manufacturer-name column
carried leading padding sized for the old, shorter value. That pushed
"株式会社チノー" past the line width and wrapped "ー" onto its own line.
Trim the padding so the row fits on one line again.
</commit_message>
<xml_diff>
--- a/apps/api/ite_api/calibration/template.docx
+++ b/apps/api/ite_api/calibration/template.docx
@@ -1005,19 +1005,17 @@
         <w:rPr>
           <w:rFonts w:ascii="MS Mincho" w:eastAsia="MS Mincho" w:hAnsi="MS Mincho" w:hint="eastAsia"/>
         </w:rPr>
-        <w:t xml:space="preserve">　　　　</w:t>
-      </w:r>
-      <w:r>
-        <w:rPr>
-          <w:rFonts w:ascii="MS Mincho" w:eastAsia="MS Mincho" w:hAnsi="MS Mincho"/>
-        </w:rPr>
-        <w:t xml:space="preserve"> </w:t>
-      </w:r>
-      <w:r>
-        <w:rPr>
-          <w:rFonts w:ascii="MS Mincho" w:eastAsia="MS Mincho" w:hAnsi="MS Mincho"/>
-        </w:rPr>
-        <w:t xml:space="preserve">        </w:t>
+        <w:t xml:space="preserve">　　</w:t>
+      </w:r>
+      <w:r>
+        <w:rPr>
+          <w:rFonts w:ascii="MS Mincho" w:eastAsia="MS Mincho" w:hAnsi="MS Mincho"/>
+        </w:rPr>
+      </w:r>
+      <w:r>
+        <w:rPr>
+          <w:rFonts w:ascii="MS Mincho" w:eastAsia="MS Mincho" w:hAnsi="MS Mincho"/>
+        </w:rPr>
       </w:r>
       <w:r>
         <w:rPr>

</xml_diff>